<commit_message>
Updating daily cartoon and writing weekly articles
</commit_message>
<xml_diff>
--- a/Articles/2026/3_DaVinci_Tips_and_Tricks/Enlightenment Summer Article Ideas/14 Masking in Color Panel.docx
+++ b/Articles/2026/3_DaVinci_Tips_and_Tricks/Enlightenment Summer Article Ideas/14 Masking in Color Panel.docx
@@ -378,17 +378,20 @@
         <w:t>. As the movie plays, it should track and move with the area that you have targeted with the Power window.</w:t>
       </w:r>
     </w:p>
+    <w:p/>
     <w:p>
       <w:r>
-        <w:rPr>
-          <w:noProof/>
-        </w:rPr>
+        <w:t>You will need to hit this button here on the color page, to be able to get to the tools used to track something.</w:t>
+      </w:r>
+    </w:p>
+    <w:p>
+      <w:r>
         <w:lastRenderedPageBreak/>
         <w:drawing>
-          <wp:inline distT="0" distB="0" distL="0" distR="0" wp14:anchorId="5AEDE6E2" wp14:editId="06927B2D">
-            <wp:extent cx="5876925" cy="1952625"/>
-            <wp:effectExtent l="76200" t="76200" r="142875" b="142875"/>
-            <wp:docPr id="2133090637" name="Picture 1"/>
+          <wp:inline distT="0" distB="0" distL="0" distR="0" wp14:anchorId="6E4B05A6" wp14:editId="5E679AF6">
+            <wp:extent cx="5943600" cy="2199640"/>
+            <wp:effectExtent l="0" t="0" r="0" b="0"/>
+            <wp:docPr id="541956085" name="Picture 1"/>
             <wp:cNvGraphicFramePr>
               <a:graphicFrameLocks xmlns:a="http://schemas.openxmlformats.org/drawingml/2006/main" noChangeAspect="1"/>
             </wp:cNvGraphicFramePr>
@@ -396,60 +399,23 @@
               <a:graphicData uri="http://schemas.openxmlformats.org/drawingml/2006/picture">
                 <pic:pic xmlns:pic="http://schemas.openxmlformats.org/drawingml/2006/picture">
                   <pic:nvPicPr>
-                    <pic:cNvPr id="2133090637" name=""/>
+                    <pic:cNvPr id="541956085" name=""/>
                     <pic:cNvPicPr/>
                   </pic:nvPicPr>
-                  <pic:blipFill rotWithShape="1">
+                  <pic:blipFill>
                     <a:blip r:embed="rId9"/>
-                    <a:srcRect l="1122" b="1348"/>
                     <a:stretch>
                       <a:fillRect/>
                     </a:stretch>
                   </pic:blipFill>
-                  <pic:spPr bwMode="auto">
+                  <pic:spPr>
                     <a:xfrm>
                       <a:off x="0" y="0"/>
-                      <a:ext cx="5876925" cy="1952625"/>
+                      <a:ext cx="5943600" cy="2199640"/>
                     </a:xfrm>
                     <a:prstGeom prst="rect">
                       <a:avLst/>
                     </a:prstGeom>
-                    <a:ln w="38100" cap="sq" cmpd="sng" algn="ctr">
-                      <a:solidFill>
-                        <a:srgbClr val="000000"/>
-                      </a:solidFill>
-                      <a:prstDash val="solid"/>
-                      <a:miter lim="800000"/>
-                      <a:headEnd type="none" w="med" len="med"/>
-                      <a:tailEnd type="none" w="med" len="med"/>
-                      <a:extLst>
-                        <a:ext uri="{C807C97D-BFC1-408E-A445-0C87EB9F89A2}">
-                          <ask:lineSketchStyleProps xmlns:ask="http://schemas.microsoft.com/office/drawing/2018/sketchyshapes" sd="0">
-                            <a:custGeom>
-                              <a:avLst/>
-                              <a:gdLst/>
-                              <a:ahLst/>
-                              <a:cxnLst/>
-                              <a:rect l="0" t="0" r="0" b="0"/>
-                              <a:pathLst/>
-                            </a:custGeom>
-                            <ask:type/>
-                          </ask:lineSketchStyleProps>
-                        </a:ext>
-                      </a:extLst>
-                    </a:ln>
-                    <a:effectLst>
-                      <a:outerShdw blurRad="50800" dist="38100" dir="2700000" algn="tl" rotWithShape="0">
-                        <a:srgbClr val="000000">
-                          <a:alpha val="43000"/>
-                        </a:srgbClr>
-                      </a:outerShdw>
-                    </a:effectLst>
-                    <a:extLst>
-                      <a:ext uri="{53640926-AAD7-44D8-BBD7-CCE9431645EC}">
-                        <a14:shadowObscured xmlns:a14="http://schemas.microsoft.com/office/drawing/2010/main"/>
-                      </a:ext>
-                    </a:extLst>
                   </pic:spPr>
                 </pic:pic>
               </a:graphicData>
@@ -460,19 +426,22 @@
     </w:p>
     <w:p>
       <w:r>
-        <w:t>Hit the Track Forward button at the top of this window.</w:t>
+        <w:t xml:space="preserve">First hit the Tracker </w:t>
+      </w:r>
+      <w:r>
+        <w:t>button at the top of this window</w:t>
+      </w:r>
+      <w:r>
+        <w:t xml:space="preserve"> to op</w:t>
       </w:r>
     </w:p>
     <w:p>
       <w:r>
-        <w:rPr>
-          <w:noProof/>
-        </w:rPr>
         <w:drawing>
-          <wp:inline distT="0" distB="0" distL="0" distR="0" wp14:anchorId="75C5C7F6" wp14:editId="13A61439">
-            <wp:extent cx="5143501" cy="2876550"/>
-            <wp:effectExtent l="76200" t="76200" r="133350" b="133350"/>
-            <wp:docPr id="1346568001" name="Picture 1"/>
+          <wp:inline distT="0" distB="0" distL="0" distR="0" wp14:anchorId="6731A4D2" wp14:editId="768CF5EF">
+            <wp:extent cx="4839375" cy="1552792"/>
+            <wp:effectExtent l="0" t="0" r="0" b="9525"/>
+            <wp:docPr id="1822100433" name="Picture 1"/>
             <wp:cNvGraphicFramePr>
               <a:graphicFrameLocks xmlns:a="http://schemas.openxmlformats.org/drawingml/2006/main" noChangeAspect="1"/>
             </wp:cNvGraphicFramePr>
@@ -480,66 +449,229 @@
               <a:graphicData uri="http://schemas.openxmlformats.org/drawingml/2006/picture">
                 <pic:pic xmlns:pic="http://schemas.openxmlformats.org/drawingml/2006/picture">
                   <pic:nvPicPr>
-                    <pic:cNvPr id="1346568001" name=""/>
+                    <pic:cNvPr id="1822100433" name=""/>
                     <pic:cNvPicPr/>
                   </pic:nvPicPr>
-                  <pic:blipFill rotWithShape="1">
+                  <pic:blipFill>
                     <a:blip r:embed="rId10"/>
-                    <a:srcRect l="1460"/>
                     <a:stretch>
                       <a:fillRect/>
                     </a:stretch>
                   </pic:blipFill>
-                  <pic:spPr bwMode="auto">
+                  <pic:spPr>
                     <a:xfrm>
                       <a:off x="0" y="0"/>
-                      <a:ext cx="5144218" cy="2876951"/>
+                      <a:ext cx="4839375" cy="1552792"/>
                     </a:xfrm>
                     <a:prstGeom prst="rect">
                       <a:avLst/>
                     </a:prstGeom>
-                    <a:ln w="38100" cap="sq" cmpd="sng" algn="ctr">
-                      <a:solidFill>
-                        <a:srgbClr val="000000"/>
-                      </a:solidFill>
-                      <a:prstDash val="solid"/>
-                      <a:miter lim="800000"/>
-                      <a:headEnd type="none" w="med" len="med"/>
-                      <a:tailEnd type="none" w="med" len="med"/>
-                      <a:extLst>
-                        <a:ext uri="{C807C97D-BFC1-408E-A445-0C87EB9F89A2}">
-                          <ask:lineSketchStyleProps xmlns:ask="http://schemas.microsoft.com/office/drawing/2018/sketchyshapes" sd="0">
-                            <a:custGeom>
-                              <a:avLst/>
-                              <a:gdLst/>
-                              <a:ahLst/>
-                              <a:cxnLst/>
-                              <a:rect l="0" t="0" r="0" b="0"/>
-                              <a:pathLst/>
-                            </a:custGeom>
-                            <ask:type/>
-                          </ask:lineSketchStyleProps>
-                        </a:ext>
-                      </a:extLst>
-                    </a:ln>
-                    <a:effectLst>
-                      <a:outerShdw blurRad="50800" dist="38100" dir="2700000" algn="tl" rotWithShape="0">
-                        <a:srgbClr val="000000">
-                          <a:alpha val="43000"/>
-                        </a:srgbClr>
-                      </a:outerShdw>
-                    </a:effectLst>
-                    <a:extLst>
-                      <a:ext uri="{53640926-AAD7-44D8-BBD7-CCE9431645EC}">
-                        <a14:shadowObscured xmlns:a14="http://schemas.microsoft.com/office/drawing/2010/main"/>
-                      </a:ext>
-                    </a:extLst>
                   </pic:spPr>
                 </pic:pic>
               </a:graphicData>
             </a:graphic>
           </wp:inline>
         </w:drawing>
+      </w:r>
+    </w:p>
+    <w:p>
+      <w:r>
+        <w:t>Then hit the track forward button here.</w:t>
+      </w:r>
+    </w:p>
+    <w:p>
+      <w:r>
+        <w:drawing>
+          <wp:inline distT="0" distB="0" distL="0" distR="0" wp14:anchorId="195E7446" wp14:editId="579F5F2B">
+            <wp:extent cx="5430008" cy="3143689"/>
+            <wp:effectExtent l="0" t="0" r="0" b="0"/>
+            <wp:docPr id="283532132" name="Picture 1"/>
+            <wp:cNvGraphicFramePr>
+              <a:graphicFrameLocks xmlns:a="http://schemas.openxmlformats.org/drawingml/2006/main" noChangeAspect="1"/>
+            </wp:cNvGraphicFramePr>
+            <a:graphic xmlns:a="http://schemas.openxmlformats.org/drawingml/2006/main">
+              <a:graphicData uri="http://schemas.openxmlformats.org/drawingml/2006/picture">
+                <pic:pic xmlns:pic="http://schemas.openxmlformats.org/drawingml/2006/picture">
+                  <pic:nvPicPr>
+                    <pic:cNvPr id="283532132" name=""/>
+                    <pic:cNvPicPr/>
+                  </pic:nvPicPr>
+                  <pic:blipFill>
+                    <a:blip r:embed="rId11"/>
+                    <a:stretch>
+                      <a:fillRect/>
+                    </a:stretch>
+                  </pic:blipFill>
+                  <pic:spPr>
+                    <a:xfrm>
+                      <a:off x="0" y="0"/>
+                      <a:ext cx="5430008" cy="3143689"/>
+                    </a:xfrm>
+                    <a:prstGeom prst="rect">
+                      <a:avLst/>
+                    </a:prstGeom>
+                  </pic:spPr>
+                </pic:pic>
+              </a:graphicData>
+            </a:graphic>
+          </wp:inline>
+        </w:drawing>
+      </w:r>
+    </w:p>
+    <w:p/>
+    <w:p>
+      <w:r>
+        <w:lastRenderedPageBreak/>
+        <w:t>A</w:t>
+      </w:r>
+      <w:r>
+        <w:t>s the movie plays it will track the logo throughout any movements that is made. This means that no matter how the man moves in the clip, the tracker will automatically keep the power window covering this logo area, and keep the logo completely covered with the color that we used to mask the emblem.</w:t>
+      </w:r>
+    </w:p>
+    <w:p/>
+    <w:p>
+      <w:pPr>
+        <w:pStyle w:val="Heading1"/>
+        <w:rPr>
+          <w:noProof/>
+        </w:rPr>
+      </w:pPr>
+      <w:r>
+        <w:rPr>
+          <w:noProof/>
+        </w:rPr>
+        <w:t xml:space="preserve">The </w:t>
+      </w:r>
+      <w:r>
+        <w:rPr>
+          <w:noProof/>
+        </w:rPr>
+        <w:t>O</w:t>
+      </w:r>
+      <w:r>
+        <w:rPr>
+          <w:noProof/>
+        </w:rPr>
+        <w:t>ther Tracking Buttons</w:t>
+      </w:r>
+    </w:p>
+    <w:p>
+      <w:r>
+        <w:t xml:space="preserve">You will notice that we have other options that we can use besides the Track forward button that we did. </w:t>
+      </w:r>
+    </w:p>
+    <w:p/>
+    <w:p/>
+    <w:p>
+      <w:r>
+        <w:drawing>
+          <wp:inline distT="0" distB="0" distL="0" distR="0" wp14:anchorId="623C11BF" wp14:editId="3581A687">
+            <wp:extent cx="4372585" cy="1743318"/>
+            <wp:effectExtent l="0" t="0" r="9525" b="9525"/>
+            <wp:docPr id="509277008" name="Picture 1"/>
+            <wp:cNvGraphicFramePr>
+              <a:graphicFrameLocks xmlns:a="http://schemas.openxmlformats.org/drawingml/2006/main" noChangeAspect="1"/>
+            </wp:cNvGraphicFramePr>
+            <a:graphic xmlns:a="http://schemas.openxmlformats.org/drawingml/2006/main">
+              <a:graphicData uri="http://schemas.openxmlformats.org/drawingml/2006/picture">
+                <pic:pic xmlns:pic="http://schemas.openxmlformats.org/drawingml/2006/picture">
+                  <pic:nvPicPr>
+                    <pic:cNvPr id="509277008" name=""/>
+                    <pic:cNvPicPr/>
+                  </pic:nvPicPr>
+                  <pic:blipFill>
+                    <a:blip r:embed="rId12"/>
+                    <a:stretch>
+                      <a:fillRect/>
+                    </a:stretch>
+                  </pic:blipFill>
+                  <pic:spPr>
+                    <a:xfrm>
+                      <a:off x="0" y="0"/>
+                      <a:ext cx="4372585" cy="1743318"/>
+                    </a:xfrm>
+                    <a:prstGeom prst="rect">
+                      <a:avLst/>
+                    </a:prstGeom>
+                  </pic:spPr>
+                </pic:pic>
+              </a:graphicData>
+            </a:graphic>
+          </wp:inline>
+        </w:drawing>
+      </w:r>
+    </w:p>
+    <w:p/>
+    <w:p>
+      <w:pPr>
+        <w:pStyle w:val="ListParagraph"/>
+        <w:numPr>
+          <w:ilvl w:val="0"/>
+          <w:numId w:val="12"/>
+        </w:numPr>
+      </w:pPr>
+      <w:r>
+        <w:t>Track one Frame Reverse (more control tracking one frame at a time)</w:t>
+      </w:r>
+    </w:p>
+    <w:p>
+      <w:pPr>
+        <w:pStyle w:val="ListParagraph"/>
+        <w:numPr>
+          <w:ilvl w:val="0"/>
+          <w:numId w:val="12"/>
+        </w:numPr>
+      </w:pPr>
+      <w:r>
+        <w:t>Track Reverse</w:t>
+      </w:r>
+    </w:p>
+    <w:p>
+      <w:pPr>
+        <w:pStyle w:val="ListParagraph"/>
+        <w:numPr>
+          <w:ilvl w:val="0"/>
+          <w:numId w:val="12"/>
+        </w:numPr>
+      </w:pPr>
+      <w:r>
+        <w:t>Stop Tracking</w:t>
+      </w:r>
+    </w:p>
+    <w:p>
+      <w:pPr>
+        <w:pStyle w:val="ListParagraph"/>
+        <w:numPr>
+          <w:ilvl w:val="0"/>
+          <w:numId w:val="12"/>
+        </w:numPr>
+      </w:pPr>
+      <w:r>
+        <w:t>Track Forward and Reverse</w:t>
+      </w:r>
+    </w:p>
+    <w:p>
+      <w:pPr>
+        <w:pStyle w:val="ListParagraph"/>
+        <w:numPr>
+          <w:ilvl w:val="0"/>
+          <w:numId w:val="12"/>
+        </w:numPr>
+      </w:pPr>
+      <w:r>
+        <w:t>Track Forward</w:t>
+      </w:r>
+    </w:p>
+    <w:p>
+      <w:pPr>
+        <w:pStyle w:val="ListParagraph"/>
+        <w:numPr>
+          <w:ilvl w:val="0"/>
+          <w:numId w:val="12"/>
+        </w:numPr>
+      </w:pPr>
+      <w:r>
+        <w:t>Track one Frame Forward</w:t>
       </w:r>
     </w:p>
     <w:sectPr>
@@ -686,6 +818,95 @@
       </w:rPr>
     </w:lvl>
   </w:abstractNum>
+  <w:abstractNum w:abstractNumId="2" w15:restartNumberingAfterBreak="0">
+    <w:nsid w:val="27F648AD"/>
+    <w:multiLevelType w:val="hybridMultilevel"/>
+    <w:tmpl w:val="E2FA4CAA"/>
+    <w:lvl w:ilvl="0" w:tplc="0409000F">
+      <w:start w:val="1"/>
+      <w:numFmt w:val="decimal"/>
+      <w:lvlText w:val="%1."/>
+      <w:lvlJc w:val="left"/>
+      <w:pPr>
+        <w:ind w:left="720" w:hanging="360"/>
+      </w:pPr>
+      <w:rPr>
+        <w:rFonts w:hint="default"/>
+      </w:rPr>
+    </w:lvl>
+    <w:lvl w:ilvl="1" w:tplc="04090019" w:tentative="1">
+      <w:start w:val="1"/>
+      <w:numFmt w:val="lowerLetter"/>
+      <w:lvlText w:val="%2."/>
+      <w:lvlJc w:val="left"/>
+      <w:pPr>
+        <w:ind w:left="1440" w:hanging="360"/>
+      </w:pPr>
+    </w:lvl>
+    <w:lvl w:ilvl="2" w:tplc="0409001B" w:tentative="1">
+      <w:start w:val="1"/>
+      <w:numFmt w:val="lowerRoman"/>
+      <w:lvlText w:val="%3."/>
+      <w:lvlJc w:val="right"/>
+      <w:pPr>
+        <w:ind w:left="2160" w:hanging="180"/>
+      </w:pPr>
+    </w:lvl>
+    <w:lvl w:ilvl="3" w:tplc="0409000F" w:tentative="1">
+      <w:start w:val="1"/>
+      <w:numFmt w:val="decimal"/>
+      <w:lvlText w:val="%4."/>
+      <w:lvlJc w:val="left"/>
+      <w:pPr>
+        <w:ind w:left="2880" w:hanging="360"/>
+      </w:pPr>
+    </w:lvl>
+    <w:lvl w:ilvl="4" w:tplc="04090019" w:tentative="1">
+      <w:start w:val="1"/>
+      <w:numFmt w:val="lowerLetter"/>
+      <w:lvlText w:val="%5."/>
+      <w:lvlJc w:val="left"/>
+      <w:pPr>
+        <w:ind w:left="3600" w:hanging="360"/>
+      </w:pPr>
+    </w:lvl>
+    <w:lvl w:ilvl="5" w:tplc="0409001B" w:tentative="1">
+      <w:start w:val="1"/>
+      <w:numFmt w:val="lowerRoman"/>
+      <w:lvlText w:val="%6."/>
+      <w:lvlJc w:val="right"/>
+      <w:pPr>
+        <w:ind w:left="4320" w:hanging="180"/>
+      </w:pPr>
+    </w:lvl>
+    <w:lvl w:ilvl="6" w:tplc="0409000F" w:tentative="1">
+      <w:start w:val="1"/>
+      <w:numFmt w:val="decimal"/>
+      <w:lvlText w:val="%7."/>
+      <w:lvlJc w:val="left"/>
+      <w:pPr>
+        <w:ind w:left="5040" w:hanging="360"/>
+      </w:pPr>
+    </w:lvl>
+    <w:lvl w:ilvl="7" w:tplc="04090019" w:tentative="1">
+      <w:start w:val="1"/>
+      <w:numFmt w:val="lowerLetter"/>
+      <w:lvlText w:val="%8."/>
+      <w:lvlJc w:val="left"/>
+      <w:pPr>
+        <w:ind w:left="5760" w:hanging="360"/>
+      </w:pPr>
+    </w:lvl>
+    <w:lvl w:ilvl="8" w:tplc="0409001B" w:tentative="1">
+      <w:start w:val="1"/>
+      <w:numFmt w:val="lowerRoman"/>
+      <w:lvlText w:val="%9."/>
+      <w:lvlJc w:val="right"/>
+      <w:pPr>
+        <w:ind w:left="6480" w:hanging="180"/>
+      </w:pPr>
+    </w:lvl>
+  </w:abstractNum>
   <w:num w:numId="1" w16cid:durableId="413626571">
     <w:abstractNumId w:val="1"/>
   </w:num>
@@ -718,6 +939,9 @@
   </w:num>
   <w:num w:numId="11" w16cid:durableId="1937248024">
     <w:abstractNumId w:val="1"/>
+  </w:num>
+  <w:num w:numId="12" w16cid:durableId="555318963">
+    <w:abstractNumId w:val="2"/>
   </w:num>
 </w:numbering>
 </file>

</xml_diff>